<commit_message>
Added Factory Method Pattern example
</commit_message>
<xml_diff>
--- a/Week1/DesignPatterns Output.docx
+++ b/Week1/DesignPatterns Output.docx
@@ -261,8 +261,937 @@
           </wp:inline>
         </w:drawing>
       </w:r>
+    </w:p>
+    <w:p>
+      <w:pPr>
+        <w:rPr>
+          <w:b/>
+          <w:sz w:val="28"/>
+          <w:lang w:val="en-US"/>
+        </w:rPr>
+      </w:pPr>
+    </w:p>
+    <w:p>
+      <w:pPr>
+        <w:rPr>
+          <w:b/>
+          <w:bCs/>
+          <w:sz w:val="28"/>
+          <w:szCs w:val="28"/>
+        </w:rPr>
+      </w:pPr>
+      <w:r>
+        <w:rPr>
+          <w:b/>
+          <w:bCs/>
+          <w:sz w:val="28"/>
+          <w:szCs w:val="28"/>
+        </w:rPr>
+        <w:lastRenderedPageBreak/>
+        <w:t>Exercise 2: Implementing the Factory Method Pattern</w:t>
+      </w:r>
+    </w:p>
+    <w:p>
+      <w:pPr>
+        <w:rPr>
+          <w:b/>
+          <w:bCs/>
+          <w:sz w:val="28"/>
+          <w:szCs w:val="28"/>
+        </w:rPr>
+      </w:pPr>
+      <w:r>
+        <w:rPr>
+          <w:b/>
+          <w:bCs/>
+          <w:sz w:val="28"/>
+          <w:szCs w:val="28"/>
+        </w:rPr>
+        <w:t>Document.java</w:t>
+      </w:r>
+    </w:p>
+    <w:p>
+      <w:pPr>
+        <w:rPr>
+          <w:b/>
+          <w:sz w:val="28"/>
+          <w:lang w:val="en-US"/>
+        </w:rPr>
+      </w:pPr>
+      <w:r>
+        <w:rPr>
+          <w:b/>
+          <w:sz w:val="28"/>
+          <w:lang w:val="en-US"/>
+        </w:rPr>
+        <w:drawing>
+          <wp:inline distT="0" distB="0" distL="0" distR="0" wp14:anchorId="2EF25882" wp14:editId="223A3923">
+            <wp:extent cx="2248095" cy="807790"/>
+            <wp:effectExtent l="0" t="0" r="0" b="0"/>
+            <wp:docPr id="4" name="Picture 4"/>
+            <wp:cNvGraphicFramePr>
+              <a:graphicFrameLocks xmlns:a="http://schemas.openxmlformats.org/drawingml/2006/main" noChangeAspect="1"/>
+            </wp:cNvGraphicFramePr>
+            <a:graphic xmlns:a="http://schemas.openxmlformats.org/drawingml/2006/main">
+              <a:graphicData uri="http://schemas.openxmlformats.org/drawingml/2006/picture">
+                <pic:pic xmlns:pic="http://schemas.openxmlformats.org/drawingml/2006/picture">
+                  <pic:nvPicPr>
+                    <pic:cNvPr id="0" name=""/>
+                    <pic:cNvPicPr/>
+                  </pic:nvPicPr>
+                  <pic:blipFill>
+                    <a:blip r:embed="rId8"/>
+                    <a:stretch>
+                      <a:fillRect/>
+                    </a:stretch>
+                  </pic:blipFill>
+                  <pic:spPr>
+                    <a:xfrm>
+                      <a:off x="0" y="0"/>
+                      <a:ext cx="2248095" cy="807790"/>
+                    </a:xfrm>
+                    <a:prstGeom prst="rect">
+                      <a:avLst/>
+                    </a:prstGeom>
+                  </pic:spPr>
+                </pic:pic>
+              </a:graphicData>
+            </a:graphic>
+          </wp:inline>
+        </w:drawing>
+      </w:r>
+    </w:p>
+    <w:p>
+      <w:pPr>
+        <w:rPr>
+          <w:b/>
+          <w:sz w:val="28"/>
+          <w:lang w:val="en-US"/>
+        </w:rPr>
+      </w:pPr>
+      <w:r>
+        <w:rPr>
+          <w:b/>
+          <w:sz w:val="28"/>
+          <w:lang w:val="en-US"/>
+        </w:rPr>
+        <w:t>DocumentFactory.java</w:t>
+      </w:r>
+    </w:p>
+    <w:p>
+      <w:pPr>
+        <w:rPr>
+          <w:b/>
+          <w:sz w:val="28"/>
+          <w:lang w:val="en-US"/>
+        </w:rPr>
+      </w:pPr>
+      <w:r>
+        <w:rPr>
+          <w:b/>
+          <w:sz w:val="28"/>
+          <w:lang w:val="en-US"/>
+        </w:rPr>
+        <w:drawing>
+          <wp:inline distT="0" distB="0" distL="0" distR="0" wp14:anchorId="6FAC3AC7" wp14:editId="706707FC">
+            <wp:extent cx="3558849" cy="975445"/>
+            <wp:effectExtent l="0" t="0" r="3810" b="0"/>
+            <wp:docPr id="5" name="Picture 5"/>
+            <wp:cNvGraphicFramePr>
+              <a:graphicFrameLocks xmlns:a="http://schemas.openxmlformats.org/drawingml/2006/main" noChangeAspect="1"/>
+            </wp:cNvGraphicFramePr>
+            <a:graphic xmlns:a="http://schemas.openxmlformats.org/drawingml/2006/main">
+              <a:graphicData uri="http://schemas.openxmlformats.org/drawingml/2006/picture">
+                <pic:pic xmlns:pic="http://schemas.openxmlformats.org/drawingml/2006/picture">
+                  <pic:nvPicPr>
+                    <pic:cNvPr id="0" name=""/>
+                    <pic:cNvPicPr/>
+                  </pic:nvPicPr>
+                  <pic:blipFill>
+                    <a:blip r:embed="rId9"/>
+                    <a:stretch>
+                      <a:fillRect/>
+                    </a:stretch>
+                  </pic:blipFill>
+                  <pic:spPr>
+                    <a:xfrm>
+                      <a:off x="0" y="0"/>
+                      <a:ext cx="3558849" cy="975445"/>
+                    </a:xfrm>
+                    <a:prstGeom prst="rect">
+                      <a:avLst/>
+                    </a:prstGeom>
+                  </pic:spPr>
+                </pic:pic>
+              </a:graphicData>
+            </a:graphic>
+          </wp:inline>
+        </w:drawing>
+      </w:r>
+    </w:p>
+    <w:p>
+      <w:pPr>
+        <w:rPr>
+          <w:b/>
+          <w:sz w:val="28"/>
+          <w:lang w:val="en-US"/>
+        </w:rPr>
+      </w:pPr>
+      <w:r>
+        <w:rPr>
+          <w:b/>
+          <w:sz w:val="28"/>
+          <w:lang w:val="en-US"/>
+        </w:rPr>
+        <w:t>ExcelDocument.java</w:t>
+      </w:r>
+    </w:p>
+    <w:p>
+      <w:pPr>
+        <w:rPr>
+          <w:b/>
+          <w:sz w:val="28"/>
+          <w:lang w:val="en-US"/>
+        </w:rPr>
+      </w:pPr>
+      <w:r>
+        <w:rPr>
+          <w:b/>
+          <w:sz w:val="28"/>
+          <w:lang w:val="en-US"/>
+        </w:rPr>
+        <w:drawing>
+          <wp:inline distT="0" distB="0" distL="0" distR="0" wp14:anchorId="572F10F9" wp14:editId="10821099">
+            <wp:extent cx="4282811" cy="1234547"/>
+            <wp:effectExtent l="0" t="0" r="3810" b="3810"/>
+            <wp:docPr id="6" name="Picture 6"/>
+            <wp:cNvGraphicFramePr>
+              <a:graphicFrameLocks xmlns:a="http://schemas.openxmlformats.org/drawingml/2006/main" noChangeAspect="1"/>
+            </wp:cNvGraphicFramePr>
+            <a:graphic xmlns:a="http://schemas.openxmlformats.org/drawingml/2006/main">
+              <a:graphicData uri="http://schemas.openxmlformats.org/drawingml/2006/picture">
+                <pic:pic xmlns:pic="http://schemas.openxmlformats.org/drawingml/2006/picture">
+                  <pic:nvPicPr>
+                    <pic:cNvPr id="0" name=""/>
+                    <pic:cNvPicPr/>
+                  </pic:nvPicPr>
+                  <pic:blipFill>
+                    <a:blip r:embed="rId10"/>
+                    <a:stretch>
+                      <a:fillRect/>
+                    </a:stretch>
+                  </pic:blipFill>
+                  <pic:spPr>
+                    <a:xfrm>
+                      <a:off x="0" y="0"/>
+                      <a:ext cx="4282811" cy="1234547"/>
+                    </a:xfrm>
+                    <a:prstGeom prst="rect">
+                      <a:avLst/>
+                    </a:prstGeom>
+                  </pic:spPr>
+                </pic:pic>
+              </a:graphicData>
+            </a:graphic>
+          </wp:inline>
+        </w:drawing>
+      </w:r>
+    </w:p>
+    <w:p>
+      <w:pPr>
+        <w:shd w:val="clear" w:color="auto" w:fill="FFFFFF"/>
+        <w:spacing w:after="0" w:line="285" w:lineRule="atLeast"/>
+        <w:rPr>
+          <w:rFonts w:eastAsia="Times New Roman" w:cstheme="minorHAnsi"/>
+          <w:b/>
+          <w:color w:val="000000"/>
+          <w:sz w:val="28"/>
+          <w:szCs w:val="21"/>
+          <w:lang w:eastAsia="en-IN"/>
+        </w:rPr>
+      </w:pPr>
+      <w:r>
+        <w:rPr>
+          <w:rFonts w:eastAsia="Times New Roman" w:cstheme="minorHAnsi"/>
+          <w:b/>
+          <w:color w:val="000000"/>
+          <w:sz w:val="28"/>
+          <w:szCs w:val="21"/>
+          <w:lang w:eastAsia="en-IN"/>
+        </w:rPr>
+        <w:t>ExcelDocumentFactory</w:t>
+      </w:r>
+      <w:r>
+        <w:rPr>
+          <w:rFonts w:eastAsia="Times New Roman" w:cstheme="minorHAnsi"/>
+          <w:b/>
+          <w:color w:val="000000"/>
+          <w:sz w:val="28"/>
+          <w:szCs w:val="21"/>
+          <w:lang w:eastAsia="en-IN"/>
+        </w:rPr>
+        <w:t>.java</w:t>
+      </w:r>
+    </w:p>
+    <w:p>
+      <w:pPr>
+        <w:shd w:val="clear" w:color="auto" w:fill="FFFFFF"/>
+        <w:spacing w:after="0" w:line="285" w:lineRule="atLeast"/>
+        <w:rPr>
+          <w:rFonts w:eastAsia="Times New Roman" w:cstheme="minorHAnsi"/>
+          <w:b/>
+          <w:color w:val="000000"/>
+          <w:sz w:val="28"/>
+          <w:szCs w:val="21"/>
+          <w:lang w:eastAsia="en-IN"/>
+        </w:rPr>
+      </w:pPr>
+      <w:r>
+        <w:rPr>
+          <w:rFonts w:eastAsia="Times New Roman" w:cstheme="minorHAnsi"/>
+          <w:b/>
+          <w:color w:val="000000"/>
+          <w:sz w:val="28"/>
+          <w:szCs w:val="21"/>
+          <w:lang w:eastAsia="en-IN"/>
+        </w:rPr>
+        <w:drawing>
+          <wp:inline distT="0" distB="0" distL="0" distR="0" wp14:anchorId="6AD6D90E" wp14:editId="1232C109">
+            <wp:extent cx="4534293" cy="1463167"/>
+            <wp:effectExtent l="0" t="0" r="0" b="3810"/>
+            <wp:docPr id="7" name="Picture 7"/>
+            <wp:cNvGraphicFramePr>
+              <a:graphicFrameLocks xmlns:a="http://schemas.openxmlformats.org/drawingml/2006/main" noChangeAspect="1"/>
+            </wp:cNvGraphicFramePr>
+            <a:graphic xmlns:a="http://schemas.openxmlformats.org/drawingml/2006/main">
+              <a:graphicData uri="http://schemas.openxmlformats.org/drawingml/2006/picture">
+                <pic:pic xmlns:pic="http://schemas.openxmlformats.org/drawingml/2006/picture">
+                  <pic:nvPicPr>
+                    <pic:cNvPr id="0" name=""/>
+                    <pic:cNvPicPr/>
+                  </pic:nvPicPr>
+                  <pic:blipFill>
+                    <a:blip r:embed="rId11"/>
+                    <a:stretch>
+                      <a:fillRect/>
+                    </a:stretch>
+                  </pic:blipFill>
+                  <pic:spPr>
+                    <a:xfrm>
+                      <a:off x="0" y="0"/>
+                      <a:ext cx="4534293" cy="1463167"/>
+                    </a:xfrm>
+                    <a:prstGeom prst="rect">
+                      <a:avLst/>
+                    </a:prstGeom>
+                  </pic:spPr>
+                </pic:pic>
+              </a:graphicData>
+            </a:graphic>
+          </wp:inline>
+        </w:drawing>
+      </w:r>
+    </w:p>
+    <w:p>
+      <w:pPr>
+        <w:shd w:val="clear" w:color="auto" w:fill="FFFFFF"/>
+        <w:spacing w:after="0" w:line="285" w:lineRule="atLeast"/>
+        <w:rPr>
+          <w:rFonts w:eastAsia="Times New Roman" w:cstheme="minorHAnsi"/>
+          <w:b/>
+          <w:color w:val="000000"/>
+          <w:sz w:val="28"/>
+          <w:szCs w:val="21"/>
+          <w:lang w:eastAsia="en-IN"/>
+        </w:rPr>
+      </w:pPr>
+    </w:p>
+    <w:p>
+      <w:pPr>
+        <w:shd w:val="clear" w:color="auto" w:fill="FFFFFF"/>
+        <w:spacing w:after="0" w:line="285" w:lineRule="atLeast"/>
+        <w:rPr>
+          <w:rFonts w:eastAsia="Times New Roman" w:cstheme="minorHAnsi"/>
+          <w:b/>
+          <w:color w:val="000000"/>
+          <w:sz w:val="28"/>
+          <w:szCs w:val="21"/>
+          <w:lang w:eastAsia="en-IN"/>
+        </w:rPr>
+      </w:pPr>
+      <w:r>
+        <w:rPr>
+          <w:rFonts w:eastAsia="Times New Roman" w:cstheme="minorHAnsi"/>
+          <w:b/>
+          <w:color w:val="000000"/>
+          <w:sz w:val="28"/>
+          <w:szCs w:val="21"/>
+          <w:lang w:eastAsia="en-IN"/>
+        </w:rPr>
+        <w:t>PdfDocument.java</w:t>
+      </w:r>
+    </w:p>
+    <w:p>
+      <w:pPr>
+        <w:shd w:val="clear" w:color="auto" w:fill="FFFFFF"/>
+        <w:spacing w:after="0" w:line="285" w:lineRule="atLeast"/>
+        <w:rPr>
+          <w:rFonts w:eastAsia="Times New Roman" w:cstheme="minorHAnsi"/>
+          <w:b/>
+          <w:color w:val="000000"/>
+          <w:sz w:val="28"/>
+          <w:szCs w:val="21"/>
+          <w:lang w:eastAsia="en-IN"/>
+        </w:rPr>
+      </w:pPr>
+      <w:r>
+        <w:rPr>
+          <w:rFonts w:eastAsia="Times New Roman" w:cstheme="minorHAnsi"/>
+          <w:b/>
+          <w:color w:val="000000"/>
+          <w:sz w:val="28"/>
+          <w:szCs w:val="21"/>
+          <w:lang w:eastAsia="en-IN"/>
+        </w:rPr>
+        <w:drawing>
+          <wp:inline distT="0" distB="0" distL="0" distR="0" wp14:anchorId="1FFCA216" wp14:editId="53440E25">
+            <wp:extent cx="4092295" cy="1310754"/>
+            <wp:effectExtent l="0" t="0" r="3810" b="3810"/>
+            <wp:docPr id="8" name="Picture 8"/>
+            <wp:cNvGraphicFramePr>
+              <a:graphicFrameLocks xmlns:a="http://schemas.openxmlformats.org/drawingml/2006/main" noChangeAspect="1"/>
+            </wp:cNvGraphicFramePr>
+            <a:graphic xmlns:a="http://schemas.openxmlformats.org/drawingml/2006/main">
+              <a:graphicData uri="http://schemas.openxmlformats.org/drawingml/2006/picture">
+                <pic:pic xmlns:pic="http://schemas.openxmlformats.org/drawingml/2006/picture">
+                  <pic:nvPicPr>
+                    <pic:cNvPr id="0" name=""/>
+                    <pic:cNvPicPr/>
+                  </pic:nvPicPr>
+                  <pic:blipFill>
+                    <a:blip r:embed="rId12"/>
+                    <a:stretch>
+                      <a:fillRect/>
+                    </a:stretch>
+                  </pic:blipFill>
+                  <pic:spPr>
+                    <a:xfrm>
+                      <a:off x="0" y="0"/>
+                      <a:ext cx="4092295" cy="1310754"/>
+                    </a:xfrm>
+                    <a:prstGeom prst="rect">
+                      <a:avLst/>
+                    </a:prstGeom>
+                  </pic:spPr>
+                </pic:pic>
+              </a:graphicData>
+            </a:graphic>
+          </wp:inline>
+        </w:drawing>
+      </w:r>
+    </w:p>
+    <w:p>
+      <w:pPr>
+        <w:shd w:val="clear" w:color="auto" w:fill="FFFFFF"/>
+        <w:spacing w:after="0" w:line="285" w:lineRule="atLeast"/>
+        <w:rPr>
+          <w:rFonts w:eastAsia="Times New Roman" w:cstheme="minorHAnsi"/>
+          <w:b/>
+          <w:color w:val="000000"/>
+          <w:sz w:val="28"/>
+          <w:szCs w:val="21"/>
+          <w:lang w:eastAsia="en-IN"/>
+        </w:rPr>
+      </w:pPr>
+    </w:p>
+    <w:p>
+      <w:pPr>
+        <w:shd w:val="clear" w:color="auto" w:fill="FFFFFF"/>
+        <w:spacing w:after="0" w:line="285" w:lineRule="atLeast"/>
+        <w:rPr>
+          <w:rFonts w:eastAsia="Times New Roman" w:cstheme="minorHAnsi"/>
+          <w:b/>
+          <w:color w:val="000000"/>
+          <w:sz w:val="28"/>
+          <w:szCs w:val="21"/>
+          <w:lang w:eastAsia="en-IN"/>
+        </w:rPr>
+      </w:pPr>
+      <w:r>
+        <w:rPr>
+          <w:rFonts w:eastAsia="Times New Roman" w:cstheme="minorHAnsi"/>
+          <w:b/>
+          <w:color w:val="000000"/>
+          <w:sz w:val="28"/>
+          <w:szCs w:val="21"/>
+          <w:lang w:eastAsia="en-IN"/>
+        </w:rPr>
+        <w:lastRenderedPageBreak/>
+        <w:t>PdfDocumentFactory.java</w:t>
+      </w:r>
+    </w:p>
+    <w:p>
+      <w:pPr>
+        <w:shd w:val="clear" w:color="auto" w:fill="FFFFFF"/>
+        <w:spacing w:after="0" w:line="285" w:lineRule="atLeast"/>
+        <w:rPr>
+          <w:rFonts w:eastAsia="Times New Roman" w:cstheme="minorHAnsi"/>
+          <w:b/>
+          <w:color w:val="000000"/>
+          <w:sz w:val="28"/>
+          <w:szCs w:val="21"/>
+          <w:lang w:eastAsia="en-IN"/>
+        </w:rPr>
+      </w:pPr>
+      <w:r>
+        <w:rPr>
+          <w:rFonts w:eastAsia="Times New Roman" w:cstheme="minorHAnsi"/>
+          <w:b/>
+          <w:color w:val="000000"/>
+          <w:sz w:val="28"/>
+          <w:szCs w:val="21"/>
+          <w:lang w:eastAsia="en-IN"/>
+        </w:rPr>
+        <w:drawing>
+          <wp:inline distT="0" distB="0" distL="0" distR="0" wp14:anchorId="074542B0" wp14:editId="5C0A385B">
+            <wp:extent cx="4282811" cy="1425064"/>
+            <wp:effectExtent l="0" t="0" r="3810" b="3810"/>
+            <wp:docPr id="9" name="Picture 9"/>
+            <wp:cNvGraphicFramePr>
+              <a:graphicFrameLocks xmlns:a="http://schemas.openxmlformats.org/drawingml/2006/main" noChangeAspect="1"/>
+            </wp:cNvGraphicFramePr>
+            <a:graphic xmlns:a="http://schemas.openxmlformats.org/drawingml/2006/main">
+              <a:graphicData uri="http://schemas.openxmlformats.org/drawingml/2006/picture">
+                <pic:pic xmlns:pic="http://schemas.openxmlformats.org/drawingml/2006/picture">
+                  <pic:nvPicPr>
+                    <pic:cNvPr id="0" name=""/>
+                    <pic:cNvPicPr/>
+                  </pic:nvPicPr>
+                  <pic:blipFill>
+                    <a:blip r:embed="rId13"/>
+                    <a:stretch>
+                      <a:fillRect/>
+                    </a:stretch>
+                  </pic:blipFill>
+                  <pic:spPr>
+                    <a:xfrm>
+                      <a:off x="0" y="0"/>
+                      <a:ext cx="4282811" cy="1425064"/>
+                    </a:xfrm>
+                    <a:prstGeom prst="rect">
+                      <a:avLst/>
+                    </a:prstGeom>
+                  </pic:spPr>
+                </pic:pic>
+              </a:graphicData>
+            </a:graphic>
+          </wp:inline>
+        </w:drawing>
+      </w:r>
+    </w:p>
+    <w:p>
+      <w:pPr>
+        <w:shd w:val="clear" w:color="auto" w:fill="FFFFFF"/>
+        <w:spacing w:after="0" w:line="285" w:lineRule="atLeast"/>
+        <w:rPr>
+          <w:rFonts w:eastAsia="Times New Roman" w:cstheme="minorHAnsi"/>
+          <w:b/>
+          <w:color w:val="000000"/>
+          <w:sz w:val="28"/>
+          <w:szCs w:val="21"/>
+          <w:lang w:eastAsia="en-IN"/>
+        </w:rPr>
+      </w:pPr>
+    </w:p>
+    <w:p>
+      <w:pPr>
+        <w:shd w:val="clear" w:color="auto" w:fill="FFFFFF"/>
+        <w:spacing w:after="0" w:line="285" w:lineRule="atLeast"/>
+        <w:rPr>
+          <w:rFonts w:eastAsia="Times New Roman" w:cstheme="minorHAnsi"/>
+          <w:b/>
+          <w:color w:val="000000"/>
+          <w:sz w:val="28"/>
+          <w:szCs w:val="21"/>
+          <w:lang w:eastAsia="en-IN"/>
+        </w:rPr>
+      </w:pPr>
+      <w:r>
+        <w:rPr>
+          <w:rFonts w:eastAsia="Times New Roman" w:cstheme="minorHAnsi"/>
+          <w:b/>
+          <w:color w:val="000000"/>
+          <w:sz w:val="28"/>
+          <w:szCs w:val="21"/>
+          <w:lang w:eastAsia="en-IN"/>
+        </w:rPr>
+        <w:t>WordDocument.java</w:t>
+      </w:r>
+    </w:p>
+    <w:p>
+      <w:pPr>
+        <w:shd w:val="clear" w:color="auto" w:fill="FFFFFF"/>
+        <w:spacing w:after="0" w:line="285" w:lineRule="atLeast"/>
+        <w:rPr>
+          <w:rFonts w:eastAsia="Times New Roman" w:cstheme="minorHAnsi"/>
+          <w:b/>
+          <w:color w:val="000000"/>
+          <w:sz w:val="28"/>
+          <w:szCs w:val="21"/>
+          <w:lang w:eastAsia="en-IN"/>
+        </w:rPr>
+      </w:pPr>
+      <w:r>
+        <w:rPr>
+          <w:rFonts w:eastAsia="Times New Roman" w:cstheme="minorHAnsi"/>
+          <w:b/>
+          <w:color w:val="000000"/>
+          <w:sz w:val="28"/>
+          <w:szCs w:val="21"/>
+          <w:lang w:eastAsia="en-IN"/>
+        </w:rPr>
+        <w:drawing>
+          <wp:inline distT="0" distB="0" distL="0" distR="0" wp14:anchorId="1C8A4C14" wp14:editId="00955078">
+            <wp:extent cx="4160881" cy="1333616"/>
+            <wp:effectExtent l="0" t="0" r="0" b="0"/>
+            <wp:docPr id="10" name="Picture 10"/>
+            <wp:cNvGraphicFramePr>
+              <a:graphicFrameLocks xmlns:a="http://schemas.openxmlformats.org/drawingml/2006/main" noChangeAspect="1"/>
+            </wp:cNvGraphicFramePr>
+            <a:graphic xmlns:a="http://schemas.openxmlformats.org/drawingml/2006/main">
+              <a:graphicData uri="http://schemas.openxmlformats.org/drawingml/2006/picture">
+                <pic:pic xmlns:pic="http://schemas.openxmlformats.org/drawingml/2006/picture">
+                  <pic:nvPicPr>
+                    <pic:cNvPr id="0" name=""/>
+                    <pic:cNvPicPr/>
+                  </pic:nvPicPr>
+                  <pic:blipFill>
+                    <a:blip r:embed="rId14"/>
+                    <a:stretch>
+                      <a:fillRect/>
+                    </a:stretch>
+                  </pic:blipFill>
+                  <pic:spPr>
+                    <a:xfrm>
+                      <a:off x="0" y="0"/>
+                      <a:ext cx="4160881" cy="1333616"/>
+                    </a:xfrm>
+                    <a:prstGeom prst="rect">
+                      <a:avLst/>
+                    </a:prstGeom>
+                  </pic:spPr>
+                </pic:pic>
+              </a:graphicData>
+            </a:graphic>
+          </wp:inline>
+        </w:drawing>
+      </w:r>
+    </w:p>
+    <w:p>
+      <w:pPr>
+        <w:shd w:val="clear" w:color="auto" w:fill="FFFFFF"/>
+        <w:spacing w:after="0" w:line="285" w:lineRule="atLeast"/>
+        <w:rPr>
+          <w:rFonts w:eastAsia="Times New Roman" w:cstheme="minorHAnsi"/>
+          <w:b/>
+          <w:color w:val="000000"/>
+          <w:sz w:val="28"/>
+          <w:szCs w:val="21"/>
+          <w:lang w:eastAsia="en-IN"/>
+        </w:rPr>
+      </w:pPr>
+    </w:p>
+    <w:p>
+      <w:pPr>
+        <w:shd w:val="clear" w:color="auto" w:fill="FFFFFF"/>
+        <w:spacing w:after="0" w:line="285" w:lineRule="atLeast"/>
+        <w:rPr>
+          <w:rFonts w:eastAsia="Times New Roman" w:cstheme="minorHAnsi"/>
+          <w:b/>
+          <w:color w:val="000000"/>
+          <w:sz w:val="28"/>
+          <w:szCs w:val="21"/>
+          <w:lang w:eastAsia="en-IN"/>
+        </w:rPr>
+      </w:pPr>
+      <w:r>
+        <w:rPr>
+          <w:rFonts w:eastAsia="Times New Roman" w:cstheme="minorHAnsi"/>
+          <w:b/>
+          <w:color w:val="000000"/>
+          <w:sz w:val="28"/>
+          <w:szCs w:val="21"/>
+          <w:lang w:eastAsia="en-IN"/>
+        </w:rPr>
+        <w:t>WordDocumentFactory.java</w:t>
+      </w:r>
+    </w:p>
+    <w:p>
+      <w:pPr>
+        <w:shd w:val="clear" w:color="auto" w:fill="FFFFFF"/>
+        <w:spacing w:after="0" w:line="285" w:lineRule="atLeast"/>
+        <w:rPr>
+          <w:rFonts w:eastAsia="Times New Roman" w:cstheme="minorHAnsi"/>
+          <w:b/>
+          <w:color w:val="000000"/>
+          <w:sz w:val="28"/>
+          <w:szCs w:val="21"/>
+          <w:lang w:eastAsia="en-IN"/>
+        </w:rPr>
+      </w:pPr>
+      <w:r>
+        <w:rPr>
+          <w:rFonts w:eastAsia="Times New Roman" w:cstheme="minorHAnsi"/>
+          <w:b/>
+          <w:color w:val="000000"/>
+          <w:sz w:val="28"/>
+          <w:szCs w:val="21"/>
+          <w:lang w:eastAsia="en-IN"/>
+        </w:rPr>
+        <w:drawing>
+          <wp:inline distT="0" distB="0" distL="0" distR="0" wp14:anchorId="281918EA" wp14:editId="01A65D0D">
+            <wp:extent cx="4320915" cy="1348857"/>
+            <wp:effectExtent l="0" t="0" r="3810" b="3810"/>
+            <wp:docPr id="11" name="Picture 11"/>
+            <wp:cNvGraphicFramePr>
+              <a:graphicFrameLocks xmlns:a="http://schemas.openxmlformats.org/drawingml/2006/main" noChangeAspect="1"/>
+            </wp:cNvGraphicFramePr>
+            <a:graphic xmlns:a="http://schemas.openxmlformats.org/drawingml/2006/main">
+              <a:graphicData uri="http://schemas.openxmlformats.org/drawingml/2006/picture">
+                <pic:pic xmlns:pic="http://schemas.openxmlformats.org/drawingml/2006/picture">
+                  <pic:nvPicPr>
+                    <pic:cNvPr id="0" name=""/>
+                    <pic:cNvPicPr/>
+                  </pic:nvPicPr>
+                  <pic:blipFill>
+                    <a:blip r:embed="rId15"/>
+                    <a:stretch>
+                      <a:fillRect/>
+                    </a:stretch>
+                  </pic:blipFill>
+                  <pic:spPr>
+                    <a:xfrm>
+                      <a:off x="0" y="0"/>
+                      <a:ext cx="4320915" cy="1348857"/>
+                    </a:xfrm>
+                    <a:prstGeom prst="rect">
+                      <a:avLst/>
+                    </a:prstGeom>
+                  </pic:spPr>
+                </pic:pic>
+              </a:graphicData>
+            </a:graphic>
+          </wp:inline>
+        </w:drawing>
+      </w:r>
+    </w:p>
+    <w:p>
+      <w:pPr>
+        <w:shd w:val="clear" w:color="auto" w:fill="FFFFFF"/>
+        <w:spacing w:after="0" w:line="285" w:lineRule="atLeast"/>
+        <w:rPr>
+          <w:rFonts w:eastAsia="Times New Roman" w:cstheme="minorHAnsi"/>
+          <w:b/>
+          <w:color w:val="000000"/>
+          <w:sz w:val="28"/>
+          <w:szCs w:val="21"/>
+          <w:lang w:eastAsia="en-IN"/>
+        </w:rPr>
+      </w:pPr>
+    </w:p>
+    <w:p>
+      <w:pPr>
+        <w:shd w:val="clear" w:color="auto" w:fill="FFFFFF"/>
+        <w:spacing w:after="0" w:line="285" w:lineRule="atLeast"/>
+        <w:rPr>
+          <w:rFonts w:eastAsia="Times New Roman" w:cstheme="minorHAnsi"/>
+          <w:b/>
+          <w:color w:val="000000"/>
+          <w:sz w:val="28"/>
+          <w:szCs w:val="21"/>
+          <w:lang w:eastAsia="en-IN"/>
+        </w:rPr>
+      </w:pPr>
+      <w:r>
+        <w:rPr>
+          <w:rFonts w:eastAsia="Times New Roman" w:cstheme="minorHAnsi"/>
+          <w:b/>
+          <w:color w:val="000000"/>
+          <w:sz w:val="28"/>
+          <w:szCs w:val="21"/>
+          <w:lang w:eastAsia="en-IN"/>
+        </w:rPr>
+        <w:t>Main.java</w:t>
+      </w:r>
+    </w:p>
+    <w:p>
+      <w:pPr>
+        <w:shd w:val="clear" w:color="auto" w:fill="FFFFFF"/>
+        <w:spacing w:after="0" w:line="285" w:lineRule="atLeast"/>
+        <w:rPr>
+          <w:rFonts w:eastAsia="Times New Roman" w:cstheme="minorHAnsi"/>
+          <w:b/>
+          <w:color w:val="000000"/>
+          <w:sz w:val="28"/>
+          <w:szCs w:val="21"/>
+          <w:lang w:eastAsia="en-IN"/>
+        </w:rPr>
+      </w:pPr>
+    </w:p>
+    <w:p>
+      <w:pPr>
+        <w:shd w:val="clear" w:color="auto" w:fill="FFFFFF"/>
+        <w:spacing w:after="0" w:line="285" w:lineRule="atLeast"/>
+        <w:rPr>
+          <w:rFonts w:eastAsia="Times New Roman" w:cstheme="minorHAnsi"/>
+          <w:b/>
+          <w:color w:val="000000"/>
+          <w:sz w:val="28"/>
+          <w:szCs w:val="21"/>
+          <w:lang w:eastAsia="en-IN"/>
+        </w:rPr>
+      </w:pPr>
+      <w:r>
+        <w:rPr>
+          <w:rFonts w:eastAsia="Times New Roman" w:cstheme="minorHAnsi"/>
+          <w:b/>
+          <w:color w:val="000000"/>
+          <w:sz w:val="28"/>
+          <w:szCs w:val="21"/>
+          <w:lang w:eastAsia="en-IN"/>
+        </w:rPr>
+        <w:drawing>
+          <wp:inline distT="0" distB="0" distL="0" distR="0" wp14:anchorId="4A998630" wp14:editId="4F8AE9B0">
+            <wp:extent cx="4602480" cy="2846981"/>
+            <wp:effectExtent l="0" t="0" r="7620" b="0"/>
+            <wp:docPr id="12" name="Picture 12"/>
+            <wp:cNvGraphicFramePr>
+              <a:graphicFrameLocks xmlns:a="http://schemas.openxmlformats.org/drawingml/2006/main" noChangeAspect="1"/>
+            </wp:cNvGraphicFramePr>
+            <a:graphic xmlns:a="http://schemas.openxmlformats.org/drawingml/2006/main">
+              <a:graphicData uri="http://schemas.openxmlformats.org/drawingml/2006/picture">
+                <pic:pic xmlns:pic="http://schemas.openxmlformats.org/drawingml/2006/picture">
+                  <pic:nvPicPr>
+                    <pic:cNvPr id="0" name=""/>
+                    <pic:cNvPicPr/>
+                  </pic:nvPicPr>
+                  <pic:blipFill>
+                    <a:blip r:embed="rId16"/>
+                    <a:stretch>
+                      <a:fillRect/>
+                    </a:stretch>
+                  </pic:blipFill>
+                  <pic:spPr>
+                    <a:xfrm>
+                      <a:off x="0" y="0"/>
+                      <a:ext cx="4602879" cy="2847228"/>
+                    </a:xfrm>
+                    <a:prstGeom prst="rect">
+                      <a:avLst/>
+                    </a:prstGeom>
+                  </pic:spPr>
+                </pic:pic>
+              </a:graphicData>
+            </a:graphic>
+          </wp:inline>
+        </w:drawing>
+      </w:r>
+    </w:p>
+    <w:p>
+      <w:pPr>
+        <w:shd w:val="clear" w:color="auto" w:fill="FFFFFF"/>
+        <w:spacing w:after="0" w:line="285" w:lineRule="atLeast"/>
+        <w:rPr>
+          <w:rFonts w:eastAsia="Times New Roman" w:cstheme="minorHAnsi"/>
+          <w:b/>
+          <w:color w:val="000000"/>
+          <w:sz w:val="28"/>
+          <w:szCs w:val="21"/>
+          <w:lang w:eastAsia="en-IN"/>
+        </w:rPr>
+      </w:pPr>
+      <w:r>
+        <w:rPr>
+          <w:rFonts w:eastAsia="Times New Roman" w:cstheme="minorHAnsi"/>
+          <w:b/>
+          <w:color w:val="000000"/>
+          <w:sz w:val="28"/>
+          <w:szCs w:val="21"/>
+          <w:lang w:eastAsia="en-IN"/>
+        </w:rPr>
+        <w:lastRenderedPageBreak/>
+        <w:t>Output</w:t>
+      </w:r>
+    </w:p>
+    <w:p>
+      <w:pPr>
+        <w:shd w:val="clear" w:color="auto" w:fill="FFFFFF"/>
+        <w:spacing w:after="0" w:line="285" w:lineRule="atLeast"/>
+        <w:rPr>
+          <w:rFonts w:eastAsia="Times New Roman" w:cstheme="minorHAnsi"/>
+          <w:b/>
+          <w:color w:val="000000"/>
+          <w:sz w:val="28"/>
+          <w:szCs w:val="21"/>
+          <w:lang w:eastAsia="en-IN"/>
+        </w:rPr>
+      </w:pPr>
+      <w:r>
+        <w:rPr>
+          <w:rFonts w:eastAsia="Times New Roman" w:cstheme="minorHAnsi"/>
+          <w:b/>
+          <w:color w:val="000000"/>
+          <w:sz w:val="28"/>
+          <w:szCs w:val="21"/>
+          <w:lang w:eastAsia="en-IN"/>
+        </w:rPr>
+        <w:drawing>
+          <wp:inline distT="0" distB="0" distL="0" distR="0" wp14:anchorId="2EB8312D" wp14:editId="108B56C6">
+            <wp:extent cx="1958510" cy="502964"/>
+            <wp:effectExtent l="0" t="0" r="3810" b="0"/>
+            <wp:docPr id="13" name="Picture 13"/>
+            <wp:cNvGraphicFramePr>
+              <a:graphicFrameLocks xmlns:a="http://schemas.openxmlformats.org/drawingml/2006/main" noChangeAspect="1"/>
+            </wp:cNvGraphicFramePr>
+            <a:graphic xmlns:a="http://schemas.openxmlformats.org/drawingml/2006/main">
+              <a:graphicData uri="http://schemas.openxmlformats.org/drawingml/2006/picture">
+                <pic:pic xmlns:pic="http://schemas.openxmlformats.org/drawingml/2006/picture">
+                  <pic:nvPicPr>
+                    <pic:cNvPr id="0" name=""/>
+                    <pic:cNvPicPr/>
+                  </pic:nvPicPr>
+                  <pic:blipFill>
+                    <a:blip r:embed="rId17"/>
+                    <a:stretch>
+                      <a:fillRect/>
+                    </a:stretch>
+                  </pic:blipFill>
+                  <pic:spPr>
+                    <a:xfrm>
+                      <a:off x="0" y="0"/>
+                      <a:ext cx="1958510" cy="502964"/>
+                    </a:xfrm>
+                    <a:prstGeom prst="rect">
+                      <a:avLst/>
+                    </a:prstGeom>
+                  </pic:spPr>
+                </pic:pic>
+              </a:graphicData>
+            </a:graphic>
+          </wp:inline>
+        </w:drawing>
+      </w:r>
       <w:bookmarkStart w:id="0" w:name="_GoBack"/>
       <w:bookmarkEnd w:id="0"/>
+    </w:p>
+    <w:p>
+      <w:pPr>
+        <w:rPr>
+          <w:b/>
+          <w:sz w:val="28"/>
+          <w:lang w:val="en-US"/>
+        </w:rPr>
+      </w:pPr>
     </w:p>
     <w:sectPr>
       <w:pgSz w:w="11906" w:h="16838"/>

</xml_diff>